<commit_message>
CV update, years of experience
</commit_message>
<xml_diff>
--- a/public/Bautista_Resume_2025.docx
+++ b/public/Bautista_Resume_2025.docx
@@ -1225,29 +1225,7 @@
                 <w:sz w:val="18"/>
                 <w:szCs w:val="18"/>
               </w:rPr>
-              <w:t xml:space="preserve">Camtasia, </w:t>
-            </w:r>
-            <w:proofErr w:type="spellStart"/>
-            <w:r>
-              <w:rPr>
-                <w:rFonts w:ascii="Inter" w:hAnsi="Inter"/>
-                <w:i/>
-                <w:iCs/>
-                <w:sz w:val="18"/>
-                <w:szCs w:val="18"/>
-              </w:rPr>
-              <w:t>CapCut</w:t>
-            </w:r>
-            <w:proofErr w:type="spellEnd"/>
-            <w:r>
-              <w:rPr>
-                <w:rFonts w:ascii="Inter" w:hAnsi="Inter"/>
-                <w:i/>
-                <w:iCs/>
-                <w:sz w:val="18"/>
-                <w:szCs w:val="18"/>
-              </w:rPr>
-              <w:t xml:space="preserve">, </w:t>
+              <w:t xml:space="preserve">Camtasia, CapCut, </w:t>
             </w:r>
             <w:proofErr w:type="spellStart"/>
             <w:r>
@@ -1711,7 +1689,23 @@
                 <w:sz w:val="20"/>
                 <w:szCs w:val="20"/>
               </w:rPr>
-              <w:t xml:space="preserve"> with 3 years of experience</w:t>
+              <w:t xml:space="preserve"> with 3</w:t>
+            </w:r>
+            <w:r>
+              <w:rPr>
+                <w:rFonts w:ascii="Inter" w:hAnsi="Inter"/>
+                <w:sz w:val="20"/>
+                <w:szCs w:val="20"/>
+              </w:rPr>
+              <w:t>+</w:t>
+            </w:r>
+            <w:r>
+              <w:rPr>
+                <w:rFonts w:ascii="Inter" w:hAnsi="Inter"/>
+                <w:sz w:val="20"/>
+                <w:szCs w:val="20"/>
+              </w:rPr>
+              <w:t xml:space="preserve"> years of experience</w:t>
             </w:r>
             <w:r>
               <w:rPr>
@@ -1728,6 +1722,54 @@
                 <w:szCs w:val="20"/>
               </w:rPr>
               <w:t>hybrid UI/UX Engineer and Frontend Developer</w:t>
+            </w:r>
+            <w:r>
+              <w:rPr>
+                <w:rFonts w:ascii="Inter" w:hAnsi="Inter"/>
+                <w:sz w:val="20"/>
+                <w:szCs w:val="20"/>
+              </w:rPr>
+              <w:t>. Along with</w:t>
+            </w:r>
+            <w:r>
+              <w:rPr>
+                <w:rFonts w:ascii="Inter" w:hAnsi="Inter"/>
+                <w:sz w:val="20"/>
+                <w:szCs w:val="20"/>
+              </w:rPr>
+              <w:t xml:space="preserve"> my</w:t>
+            </w:r>
+            <w:r>
+              <w:rPr>
+                <w:rFonts w:ascii="Inter" w:hAnsi="Inter"/>
+                <w:sz w:val="20"/>
+                <w:szCs w:val="20"/>
+              </w:rPr>
+              <w:t xml:space="preserve"> </w:t>
+            </w:r>
+            <w:r>
+              <w:rPr>
+                <w:rFonts w:ascii="Inter" w:hAnsi="Inter"/>
+                <w:sz w:val="20"/>
+                <w:szCs w:val="20"/>
+              </w:rPr>
+              <w:t xml:space="preserve">5+ years of relevant experience in </w:t>
+            </w:r>
+            <w:r>
+              <w:rPr>
+                <w:rFonts w:ascii="Inter" w:hAnsi="Inter"/>
+                <w:sz w:val="20"/>
+                <w:szCs w:val="20"/>
+              </w:rPr>
+              <w:t>D</w:t>
+            </w:r>
+            <w:r>
+              <w:rPr>
+                <w:rFonts w:ascii="Inter" w:hAnsi="Inter"/>
+                <w:sz w:val="20"/>
+                <w:szCs w:val="20"/>
+              </w:rPr>
+              <w:t>esign</w:t>
             </w:r>
             <w:r>
               <w:rPr>
@@ -2627,7 +2669,6 @@
                 <w:sz w:val="20"/>
                 <w:szCs w:val="20"/>
               </w:rPr>
-              <w:lastRenderedPageBreak/>
               <mc:AlternateContent>
                 <mc:Choice Requires="wps">
                   <w:drawing>
@@ -5667,25 +5708,7 @@
                   <w:sz w:val="20"/>
                   <w:szCs w:val="20"/>
                 </w:rPr>
-                <w:t>https://youtube.com/watch?v=</w:t>
-              </w:r>
-              <w:r>
-                <w:rPr>
-                  <w:rStyle w:val="Hyperlink"/>
-                  <w:rFonts w:ascii="Inter" w:hAnsi="Inter"/>
-                  <w:sz w:val="20"/>
-                  <w:szCs w:val="20"/>
-                </w:rPr>
-                <w:t>A</w:t>
-              </w:r>
-              <w:r>
-                <w:rPr>
-                  <w:rStyle w:val="Hyperlink"/>
-                  <w:rFonts w:ascii="Inter" w:hAnsi="Inter"/>
-                  <w:sz w:val="20"/>
-                  <w:szCs w:val="20"/>
-                </w:rPr>
-                <w:t>M1zNu8hqFw</w:t>
+                <w:t>https://youtube.com/watch?v=AM1zNu8hqFw</w:t>
               </w:r>
             </w:hyperlink>
           </w:p>
@@ -7305,6 +7328,7 @@
   <w:style w:type="character" w:default="1" w:styleId="DefaultParagraphFont">
     <w:name w:val="Default Paragraph Font"/>
     <w:uiPriority w:val="1"/>
+    <w:semiHidden/>
     <w:unhideWhenUsed/>
   </w:style>
   <w:style w:type="table" w:default="1" w:styleId="TableNormal">

</xml_diff>

<commit_message>
updated relevant years of experience
</commit_message>
<xml_diff>
--- a/public/Bautista_Resume_2025.docx
+++ b/public/Bautista_Resume_2025.docx
@@ -1753,7 +1753,15 @@
                 <w:sz w:val="20"/>
                 <w:szCs w:val="20"/>
               </w:rPr>
-              <w:t xml:space="preserve">5+ years of relevant experience in </w:t>
+              <w:t>6</w:t>
+            </w:r>
+            <w:r>
+              <w:rPr>
+                <w:rFonts w:ascii="Inter" w:hAnsi="Inter"/>
+                <w:sz w:val="20"/>
+                <w:szCs w:val="20"/>
+              </w:rPr>
+              <w:t xml:space="preserve">+ years of relevant experience in </w:t>
             </w:r>
             <w:r>
               <w:rPr>

</xml_diff>